<commit_message>
Hazard Hunt ready for generated art; exports rebuilt; downloads list spacing fixed in Word and PDF
</commit_message>
<xml_diff>
--- a/downloads/student/Unit 00/Handout 00.04 - Team Norms Contract.docx
+++ b/downloads/student/Unit 00/Handout 00.04 - Team Norms Contract.docx
@@ -691,137 +691,167 @@
       <w:r>
         <w:t xml:space="preserve">Examples of norms that pass the test:</w:t>
       </w:r>
-      <w:r>
-        <w:t xml:space="preserve"> </w:t>
-      </w:r>
-      <w:r>
-        <w:t xml:space="preserve">- We wait for the Station Manager’s point before we start.</w:t>
-      </w:r>
-      <w:r>
-        <w:t xml:space="preserve"> </w:t>
-      </w:r>
-      <w:r>
-        <w:t xml:space="preserve">- We say the amount out loud before we pour.</w:t>
-      </w:r>
-      <w:r>
-        <w:t xml:space="preserve"> </w:t>
-      </w:r>
-      <w:r>
-        <w:t xml:space="preserve">- We clean our own spill.</w:t>
-      </w:r>
-      <w:r>
-        <w:t xml:space="preserve"> </w:t>
-      </w:r>
-      <w:r>
-        <w:t xml:space="preserve">- Nobody leaves until the station check.</w:t>
-      </w:r>
-      <w:r>
-        <w:t xml:space="preserve"> </w:t>
-      </w:r>
-      <w:r>
-        <w:t xml:space="preserve">- We ask the quiet person what they think before we decide.</w:t>
-      </w:r>
-    </w:p>
-    <w:p>
-      <w:pPr>
-        <w:pStyle w:val="BodyText"/>
-      </w:pPr>
-      <w:r>
-        <w:t xml:space="preserve">Sentence starter: "We ___ before we ___."</w:t>
-      </w:r>
-    </w:p>
-    <w:p>
-      <w:pPr>
-        <w:pStyle w:val="BodyText"/>
-      </w:pPr>
-      <w:r>
-        <w:t xml:space="preserve">Our four norms:</w:t>
-      </w:r>
-    </w:p>
-    <w:p>
-      <w:r>
-        <w:br w:type="page"/>
-      </w:r>
-    </w:p>
-    <w:p>
-      <w:r>
-        <w:br w:type="page"/>
-      </w:r>
-    </w:p>
-    <w:p>
-      <w:r>
-        <w:br w:type="page"/>
-      </w:r>
-    </w:p>
-    <w:p>
-      <w:r>
-        <w:br w:type="page"/>
-      </w:r>
-    </w:p>
-    <w:p>
-      <w:pPr>
-        <w:pStyle w:val="FirstParagraph"/>
-      </w:pPr>
-      <w:r>
-        <w:t xml:space="preserve">Grade 6: three norms. Grade 8 stretch: a fifth norm that says what the team does when someone breaks a norm: ________________________________________________</w:t>
-      </w:r>
-    </w:p>
-    <w:p>
-      <w:pPr>
-        <w:pStyle w:val="BodyText"/>
-      </w:pPr>
-      <w:r>
-        <w:t xml:space="preserve">We agree to these norms for every team task this year. If we break one, we fix it at the table first.</w:t>
-      </w:r>
-    </w:p>
-    <w:p>
-      <w:pPr>
-        <w:pStyle w:val="BodyText"/>
-      </w:pPr>
-      <w:r>
-        <w:t xml:space="preserve">Signatures (every team member):</w:t>
-      </w:r>
-    </w:p>
-    <w:p>
-      <w:r>
-        <w:br w:type="page"/>
-      </w:r>
-    </w:p>
-    <w:p>
-      <w:pPr>
-        <w:pStyle w:val="BodyText"/>
-      </w:pPr>
-      <w:r>
-        <w:t xml:space="preserve">Teacher: ______________________ Date: __________</w:t>
-      </w:r>
-    </w:p>
-    <w:p>
-      <w:pPr>
-        <w:pStyle w:val="Heading2"/>
-      </w:pPr>
-      <w:bookmarkStart w:id="24" w:name="exit-card"/>
-      <w:r>
-        <w:t xml:space="preserve">Exit card</w:t>
-      </w:r>
-      <w:bookmarkEnd w:id="24"/>
     </w:p>
     <w:p>
       <w:pPr>
         <w:numPr>
           <w:ilvl w:val="0"/>
-          <w:numId w:val="1002"/>
+          <w:numId w:val="1001"/>
         </w:numPr>
         <w:pStyle w:val="Compact"/>
       </w:pPr>
       <w:r>
-        <w:t xml:space="preserve">My role today and one thing I did in it: ________________________________</w:t>
+        <w:t xml:space="preserve">We wait for the Station Manager’s point before we start.</w:t>
       </w:r>
     </w:p>
     <w:p>
       <w:pPr>
         <w:numPr>
           <w:ilvl w:val="0"/>
-          <w:numId w:val="1002"/>
+          <w:numId w:val="1001"/>
+        </w:numPr>
+        <w:pStyle w:val="Compact"/>
+      </w:pPr>
+      <w:r>
+        <w:t xml:space="preserve">We say the amount out loud before we pour.</w:t>
+      </w:r>
+    </w:p>
+    <w:p>
+      <w:pPr>
+        <w:numPr>
+          <w:ilvl w:val="0"/>
+          <w:numId w:val="1001"/>
+        </w:numPr>
+        <w:pStyle w:val="Compact"/>
+      </w:pPr>
+      <w:r>
+        <w:t xml:space="preserve">We clean our own spill.</w:t>
+      </w:r>
+    </w:p>
+    <w:p>
+      <w:pPr>
+        <w:numPr>
+          <w:ilvl w:val="0"/>
+          <w:numId w:val="1001"/>
+        </w:numPr>
+        <w:pStyle w:val="Compact"/>
+      </w:pPr>
+      <w:r>
+        <w:t xml:space="preserve">Nobody leaves until the station check.</w:t>
+      </w:r>
+    </w:p>
+    <w:p>
+      <w:pPr>
+        <w:numPr>
+          <w:ilvl w:val="0"/>
+          <w:numId w:val="1001"/>
+        </w:numPr>
+        <w:pStyle w:val="Compact"/>
+      </w:pPr>
+      <w:r>
+        <w:t xml:space="preserve">We ask the quiet person what they think before we decide.</w:t>
+      </w:r>
+    </w:p>
+    <w:p>
+      <w:pPr>
+        <w:pStyle w:val="FirstParagraph"/>
+      </w:pPr>
+      <w:r>
+        <w:t xml:space="preserve">Sentence starter: "We ___ before we ___."</w:t>
+      </w:r>
+    </w:p>
+    <w:p>
+      <w:pPr>
+        <w:pStyle w:val="BodyText"/>
+      </w:pPr>
+      <w:r>
+        <w:t xml:space="preserve">Our four norms:</w:t>
+      </w:r>
+    </w:p>
+    <w:p>
+      <w:r>
+        <w:br w:type="page"/>
+      </w:r>
+    </w:p>
+    <w:p>
+      <w:r>
+        <w:br w:type="page"/>
+      </w:r>
+    </w:p>
+    <w:p>
+      <w:r>
+        <w:br w:type="page"/>
+      </w:r>
+    </w:p>
+    <w:p>
+      <w:r>
+        <w:br w:type="page"/>
+      </w:r>
+    </w:p>
+    <w:p>
+      <w:pPr>
+        <w:pStyle w:val="FirstParagraph"/>
+      </w:pPr>
+      <w:r>
+        <w:t xml:space="preserve">Grade 6: three norms. Grade 8 stretch: a fifth norm that says what the team does when someone breaks a norm: ________________________________________________</w:t>
+      </w:r>
+    </w:p>
+    <w:p>
+      <w:pPr>
+        <w:pStyle w:val="BodyText"/>
+      </w:pPr>
+      <w:r>
+        <w:t xml:space="preserve">We agree to these norms for every team task this year. If we break one, we fix it at the table first.</w:t>
+      </w:r>
+    </w:p>
+    <w:p>
+      <w:pPr>
+        <w:pStyle w:val="BodyText"/>
+      </w:pPr>
+      <w:r>
+        <w:t xml:space="preserve">Signatures (every team member):</w:t>
+      </w:r>
+    </w:p>
+    <w:p>
+      <w:r>
+        <w:br w:type="page"/>
+      </w:r>
+    </w:p>
+    <w:p>
+      <w:pPr>
+        <w:pStyle w:val="BodyText"/>
+      </w:pPr>
+      <w:r>
+        <w:t xml:space="preserve">Teacher: ______________________ Date: __________</w:t>
+      </w:r>
+    </w:p>
+    <w:p>
+      <w:pPr>
+        <w:pStyle w:val="Heading2"/>
+      </w:pPr>
+      <w:bookmarkStart w:id="24" w:name="exit-card"/>
+      <w:r>
+        <w:t xml:space="preserve">Exit card</w:t>
+      </w:r>
+      <w:bookmarkEnd w:id="24"/>
+    </w:p>
+    <w:p>
+      <w:pPr>
+        <w:numPr>
+          <w:ilvl w:val="0"/>
+          <w:numId w:val="1003"/>
+        </w:numPr>
+        <w:pStyle w:val="Compact"/>
+      </w:pPr>
+      <w:r>
+        <w:t xml:space="preserve">My role today and one thing I did in it: ________________________________</w:t>
+      </w:r>
+    </w:p>
+    <w:p>
+      <w:pPr>
+        <w:numPr>
+          <w:ilvl w:val="0"/>
+          <w:numId w:val="1003"/>
         </w:numPr>
         <w:pStyle w:val="Compact"/>
       </w:pPr>
@@ -1011,8 +1041,111 @@
       </w:pPr>
     </w:lvl>
   </w:abstractNum>
+  <w:abstractNum w:abstractNumId="991">
+    <w:nsid w:val="ea454b4c"/>
+    <w:multiLevelType w:val="multilevel"/>
+    <w:lvl w:ilvl="0">
+      <w:numFmt w:val="bullet"/>
+      <w:lvlText w:val="•"/>
+      <w:lvlJc w:val="left"/>
+      <w:pPr>
+        <w:tabs>
+          <w:tab w:val="num" w:pos="0"/>
+        </w:tabs>
+        <w:ind w:left="480" w:hanging="480"/>
+      </w:pPr>
+    </w:lvl>
+    <w:lvl w:ilvl="1">
+      <w:numFmt w:val="bullet"/>
+      <w:lvlText w:val="–"/>
+      <w:lvlJc w:val="left"/>
+      <w:pPr>
+        <w:tabs>
+          <w:tab w:val="num" w:pos="720"/>
+        </w:tabs>
+        <w:ind w:left="1200" w:hanging="480"/>
+      </w:pPr>
+    </w:lvl>
+    <w:lvl w:ilvl="2">
+      <w:numFmt w:val="bullet"/>
+      <w:lvlText w:val="•"/>
+      <w:lvlJc w:val="left"/>
+      <w:pPr>
+        <w:tabs>
+          <w:tab w:val="num" w:pos="1440"/>
+        </w:tabs>
+        <w:ind w:left="1920" w:hanging="480"/>
+      </w:pPr>
+    </w:lvl>
+    <w:lvl w:ilvl="3">
+      <w:numFmt w:val="bullet"/>
+      <w:lvlText w:val="–"/>
+      <w:lvlJc w:val="left"/>
+      <w:pPr>
+        <w:tabs>
+          <w:tab w:val="num" w:pos="2160"/>
+        </w:tabs>
+        <w:ind w:left="2640" w:hanging="480"/>
+      </w:pPr>
+    </w:lvl>
+    <w:lvl w:ilvl="4">
+      <w:numFmt w:val="bullet"/>
+      <w:lvlText w:val="•"/>
+      <w:lvlJc w:val="left"/>
+      <w:pPr>
+        <w:tabs>
+          <w:tab w:val="num" w:pos="2880"/>
+        </w:tabs>
+        <w:ind w:left="3360" w:hanging="480"/>
+      </w:pPr>
+    </w:lvl>
+    <w:lvl w:ilvl="5">
+      <w:numFmt w:val="bullet"/>
+      <w:lvlText w:val="–"/>
+      <w:lvlJc w:val="left"/>
+      <w:pPr>
+        <w:tabs>
+          <w:tab w:val="num" w:pos="3600"/>
+        </w:tabs>
+        <w:ind w:left="4080" w:hanging="480"/>
+      </w:pPr>
+    </w:lvl>
+    <w:lvl w:ilvl="6">
+      <w:numFmt w:val="bullet"/>
+      <w:lvlText w:val="•"/>
+      <w:lvlJc w:val="left"/>
+      <w:pPr>
+        <w:tabs>
+          <w:tab w:val="num" w:pos="4320"/>
+        </w:tabs>
+        <w:ind w:left="4800" w:hanging="480"/>
+      </w:pPr>
+    </w:lvl>
+    <w:lvl w:ilvl="7">
+      <w:numFmt w:val="bullet"/>
+      <w:lvlText w:val="–"/>
+      <w:lvlJc w:val="left"/>
+      <w:pPr>
+        <w:tabs>
+          <w:tab w:val="num" w:pos="5040"/>
+        </w:tabs>
+        <w:ind w:left="5520" w:hanging="480"/>
+      </w:pPr>
+    </w:lvl>
+    <w:lvl w:ilvl="8">
+      <w:numFmt w:val="bullet"/>
+      <w:lvlText w:val="•"/>
+      <w:lvlJc w:val="left"/>
+      <w:pPr>
+        <w:tabs>
+          <w:tab w:val="num" w:pos="5760"/>
+        </w:tabs>
+        <w:ind w:left="6240" w:hanging="480"/>
+      </w:pPr>
+    </w:lvl>
+  </w:abstractNum>
   <w:abstractNum w:abstractNumId="99411">
-    <w:nsid w:val="ea454b4c"/>
+    <w:nsid w:val="71315dca"/>
     <w:multiLevelType w:val="multilevel"/>
     <w:lvl w:ilvl="0">
       <w:start w:val="1"/>
@@ -1127,6 +1260,9 @@
     <w:abstractNumId w:val="990"/>
   </w:num>
   <w:num w:numId="1001">
+    <w:abstractNumId w:val="991"/>
+  </w:num>
+  <w:num w:numId="1002">
     <w:abstractNumId w:val="99411"/>
     <w:lvlOverride w:ilvl="0">
       <w:startOverride w:val="1"/>
@@ -1156,7 +1292,7 @@
       <w:startOverride w:val="1"/>
     </w:lvlOverride>
   </w:num>
-  <w:num w:numId="1002">
+  <w:num w:numId="1003">
     <w:abstractNumId w:val="99411"/>
     <w:lvlOverride w:ilvl="0">
       <w:startOverride w:val="1"/>

</xml_diff>